<commit_message>
Included Ben Harvey YML script
</commit_message>
<xml_diff>
--- a/2-Dockers/3-Docker Networking.docx
+++ b/2-Dockers/3-Docker Networking.docx
@@ -1,6 +1,6 @@
 
 <file path=word/document.xml><?xml version="1.0" encoding="utf-8"?>
-<w:document xmlns:wpc="http://schemas.microsoft.com/office/word/2010/wordprocessingCanvas" xmlns:cx="http://schemas.microsoft.com/office/drawing/2014/chartex" xmlns:cx1="http://schemas.microsoft.com/office/drawing/2015/9/8/chartex" xmlns:cx2="http://schemas.microsoft.com/office/drawing/2015/10/21/chartex" xmlns:cx3="http://schemas.microsoft.com/office/drawing/2016/5/9/chartex" xmlns:cx4="http://schemas.microsoft.com/office/drawing/2016/5/10/chartex" xmlns:cx5="http://schemas.microsoft.com/office/drawing/2016/5/11/chartex" xmlns:cx6="http://schemas.microsoft.com/office/drawing/2016/5/12/chartex" xmlns:cx7="http://schemas.microsoft.com/office/drawing/2016/5/13/chartex" xmlns:cx8="http://schemas.microsoft.com/office/drawing/2016/5/14/chartex" xmlns:mc="http://schemas.openxmlformats.org/markup-compatibility/2006" xmlns:aink="http://schemas.microsoft.com/office/drawing/2016/ink" xmlns:am3d="http://schemas.microsoft.com/office/drawing/2017/model3d" xmlns:o="urn:schemas-microsoft-com:office:office" xmlns:oel="http://schemas.microsoft.com/office/2019/extlst" xmlns:r="http://schemas.openxmlformats.org/officeDocument/2006/relationships" xmlns:m="http://schemas.openxmlformats.org/officeDocument/2006/math" xmlns:v="urn:schemas-microsoft-com:vml" xmlns:wp14="http://schemas.microsoft.com/office/word/2010/wordprocessingDrawing" xmlns:wp="http://schemas.openxmlformats.org/drawingml/2006/wordprocessingDrawing" xmlns:w10="urn:schemas-microsoft-com:office:word" xmlns:w="http://schemas.openxmlformats.org/wordprocessingml/2006/main" xmlns:w14="http://schemas.microsoft.com/office/word/2010/wordml" xmlns:w15="http://schemas.microsoft.com/office/word/2012/wordml" xmlns:w16cex="http://schemas.microsoft.com/office/word/2018/wordml/cex" xmlns:w16cid="http://schemas.microsoft.com/office/word/2016/wordml/cid" xmlns:w16="http://schemas.microsoft.com/office/word/2018/wordml" xmlns:w16du="http://schemas.microsoft.com/office/word/2023/wordml/word16du" xmlns:w16sdtdh="http://schemas.microsoft.com/office/word/2020/wordml/sdtdatahash" xmlns:w16se="http://schemas.microsoft.com/office/word/2015/wordml/symex" xmlns:wpg="http://schemas.microsoft.com/office/word/2010/wordprocessingGroup" xmlns:wpi="http://schemas.microsoft.com/office/word/2010/wordprocessingInk" xmlns:wne="http://schemas.microsoft.com/office/word/2006/wordml" xmlns:wps="http://schemas.microsoft.com/office/word/2010/wordprocessingShape" mc:Ignorable="w14 w15 w16se w16cid w16 w16cex w16sdtdh w16du wp14">
+<w:document xmlns:wpc="http://schemas.microsoft.com/office/word/2010/wordprocessingCanvas" xmlns:cx="http://schemas.microsoft.com/office/drawing/2014/chartex" xmlns:cx1="http://schemas.microsoft.com/office/drawing/2015/9/8/chartex" xmlns:cx2="http://schemas.microsoft.com/office/drawing/2015/10/21/chartex" xmlns:cx3="http://schemas.microsoft.com/office/drawing/2016/5/9/chartex" xmlns:cx4="http://schemas.microsoft.com/office/drawing/2016/5/10/chartex" xmlns:cx5="http://schemas.microsoft.com/office/drawing/2016/5/11/chartex" xmlns:cx6="http://schemas.microsoft.com/office/drawing/2016/5/12/chartex" xmlns:cx7="http://schemas.microsoft.com/office/drawing/2016/5/13/chartex" xmlns:cx8="http://schemas.microsoft.com/office/drawing/2016/5/14/chartex" xmlns:mc="http://schemas.openxmlformats.org/markup-compatibility/2006" xmlns:aink="http://schemas.microsoft.com/office/drawing/2016/ink" xmlns:am3d="http://schemas.microsoft.com/office/drawing/2017/model3d" xmlns:o="urn:schemas-microsoft-com:office:office" xmlns:oel="http://schemas.microsoft.com/office/2019/extlst" xmlns:r="http://schemas.openxmlformats.org/officeDocument/2006/relationships" xmlns:m="http://schemas.openxmlformats.org/officeDocument/2006/math" xmlns:v="urn:schemas-microsoft-com:vml" xmlns:wp14="http://schemas.microsoft.com/office/word/2010/wordprocessingDrawing" xmlns:wp="http://schemas.openxmlformats.org/drawingml/2006/wordprocessingDrawing" xmlns:w10="urn:schemas-microsoft-com:office:word" xmlns:w="http://schemas.openxmlformats.org/wordprocessingml/2006/main" xmlns:w14="http://schemas.microsoft.com/office/word/2010/wordml" xmlns:w15="http://schemas.microsoft.com/office/word/2012/wordml" xmlns:w16cex="http://schemas.microsoft.com/office/word/2018/wordml/cex" xmlns:w16cid="http://schemas.microsoft.com/office/word/2016/wordml/cid" xmlns:w16="http://schemas.microsoft.com/office/word/2018/wordml" xmlns:w16du="http://schemas.microsoft.com/office/word/2023/wordml/word16du" xmlns:w16sdtdh="http://schemas.microsoft.com/office/word/2020/wordml/sdtdatahash" xmlns:w16sdtfl="http://schemas.microsoft.com/office/word/2024/wordml/sdtformatlock" xmlns:w16se="http://schemas.microsoft.com/office/word/2015/wordml/symex" xmlns:wpg="http://schemas.microsoft.com/office/word/2010/wordprocessingGroup" xmlns:wpi="http://schemas.microsoft.com/office/word/2010/wordprocessingInk" xmlns:wne="http://schemas.microsoft.com/office/word/2006/wordml" xmlns:wps="http://schemas.microsoft.com/office/word/2010/wordprocessingShape" mc:Ignorable="w14 w15 w16se w16cid w16 w16cex w16sdtdh w16sdtfl w16du wp14">
   <w:body>
     <w:p>
       <w:pPr>
@@ -105,21 +105,12 @@
           <w:numId w:val="3"/>
         </w:numPr>
       </w:pPr>
-      <w:proofErr w:type="spellStart"/>
       <w:r>
         <w:rPr>
           <w:b/>
           <w:bCs/>
         </w:rPr>
-        <w:t>Macvlan</w:t>
-      </w:r>
-      <w:proofErr w:type="spellEnd"/>
-      <w:r>
-        <w:rPr>
-          <w:b/>
-          <w:bCs/>
-        </w:rPr>
-        <w:t xml:space="preserve"> network</w:t>
+        <w:t>Macvlan network</w:t>
       </w:r>
       <w:r>
         <w:t xml:space="preserve">: </w:t>
@@ -195,7 +186,6 @@
         </w:numPr>
       </w:pPr>
       <w:r>
-        <w:lastRenderedPageBreak/>
         <w:t>Create folder for the structure we need for three Micro services</w:t>
       </w:r>
       <w:r>
@@ -263,15 +253,13 @@
       <w:r>
         <w:br/>
       </w:r>
-      <w:proofErr w:type="spellStart"/>
       <w:r>
         <w:rPr>
           <w:sz w:val="32"/>
           <w:szCs w:val="32"/>
         </w:rPr>
-        <w:t>npm</w:t>
-      </w:r>
-      <w:proofErr w:type="spellEnd"/>
+        <w:t xml:space="preserve">npm </w:t>
+      </w:r>
       <w:r>
         <w:rPr>
           <w:sz w:val="32"/>
@@ -284,23 +272,7 @@
           <w:sz w:val="32"/>
           <w:szCs w:val="32"/>
         </w:rPr>
-        <w:t xml:space="preserve"> </w:t>
-      </w:r>
-      <w:proofErr w:type="spellStart"/>
-      <w:r>
-        <w:rPr>
-          <w:sz w:val="32"/>
-          <w:szCs w:val="32"/>
-        </w:rPr>
-        <w:t>init</w:t>
-      </w:r>
-      <w:proofErr w:type="spellEnd"/>
-      <w:r>
-        <w:rPr>
-          <w:sz w:val="32"/>
-          <w:szCs w:val="32"/>
-        </w:rPr>
-        <w:t xml:space="preserve"> </w:t>
+        <w:t xml:space="preserve">init </w:t>
       </w:r>
       <w:r>
         <w:rPr>
@@ -335,7 +307,6 @@
       <w:r>
         <w:t xml:space="preserve">Create an empty file in each folder called </w:t>
       </w:r>
-      <w:proofErr w:type="spellStart"/>
       <w:r>
         <w:rPr>
           <w:b/>
@@ -345,7 +316,6 @@
         </w:rPr>
         <w:t>Dockerfile</w:t>
       </w:r>
-      <w:proofErr w:type="spellEnd"/>
       <w:r>
         <w:rPr>
           <w:b/>
@@ -389,7 +359,6 @@
       <w:r>
         <w:t xml:space="preserve">You will now modify each </w:t>
       </w:r>
-      <w:proofErr w:type="spellStart"/>
       <w:r>
         <w:rPr>
           <w:b/>
@@ -399,7 +368,6 @@
         </w:rPr>
         <w:t>package.json</w:t>
       </w:r>
-      <w:proofErr w:type="spellEnd"/>
       <w:r>
         <w:rPr>
           <w:sz w:val="24"/>
@@ -1151,15 +1119,7 @@
         </w:numPr>
       </w:pPr>
       <w:r>
-        <w:t xml:space="preserve">Copy the following text to the </w:t>
-      </w:r>
-      <w:proofErr w:type="spellStart"/>
-      <w:r>
-        <w:t>Dockerfile</w:t>
-      </w:r>
-      <w:proofErr w:type="spellEnd"/>
-      <w:r>
-        <w:t xml:space="preserve"> of the order-service</w:t>
+        <w:t>Copy the following text to the Dockerfile of the order-service</w:t>
       </w:r>
     </w:p>
     <w:p>
@@ -1403,59 +1363,7 @@
           <w:lang w:eastAsia="en-GB"/>
           <w14:ligatures w14:val="none"/>
         </w:rPr>
-        <w:t xml:space="preserve"># Copy </w:t>
-      </w:r>
-      <w:proofErr w:type="spellStart"/>
-      <w:r>
-        <w:rPr>
-          <w:rFonts w:ascii="Consolas" w:eastAsia="Times New Roman" w:hAnsi="Consolas" w:cs="Times New Roman"/>
-          <w:color w:val="6A9955"/>
-          <w:kern w:val="0"/>
-          <w:sz w:val="21"/>
-          <w:szCs w:val="21"/>
-          <w:lang w:eastAsia="en-GB"/>
-          <w14:ligatures w14:val="none"/>
-        </w:rPr>
-        <w:t>package.json</w:t>
-      </w:r>
-      <w:proofErr w:type="spellEnd"/>
-      <w:r>
-        <w:rPr>
-          <w:rFonts w:ascii="Consolas" w:eastAsia="Times New Roman" w:hAnsi="Consolas" w:cs="Times New Roman"/>
-          <w:color w:val="6A9955"/>
-          <w:kern w:val="0"/>
-          <w:sz w:val="21"/>
-          <w:szCs w:val="21"/>
-          <w:lang w:eastAsia="en-GB"/>
-          <w14:ligatures w14:val="none"/>
-        </w:rPr>
-        <w:t xml:space="preserve"> and package-</w:t>
-      </w:r>
-      <w:proofErr w:type="spellStart"/>
-      <w:r>
-        <w:rPr>
-          <w:rFonts w:ascii="Consolas" w:eastAsia="Times New Roman" w:hAnsi="Consolas" w:cs="Times New Roman"/>
-          <w:color w:val="6A9955"/>
-          <w:kern w:val="0"/>
-          <w:sz w:val="21"/>
-          <w:szCs w:val="21"/>
-          <w:lang w:eastAsia="en-GB"/>
-          <w14:ligatures w14:val="none"/>
-        </w:rPr>
-        <w:t>lock.json</w:t>
-      </w:r>
-      <w:proofErr w:type="spellEnd"/>
-      <w:r>
-        <w:rPr>
-          <w:rFonts w:ascii="Consolas" w:eastAsia="Times New Roman" w:hAnsi="Consolas" w:cs="Times New Roman"/>
-          <w:color w:val="6A9955"/>
-          <w:kern w:val="0"/>
-          <w:sz w:val="21"/>
-          <w:szCs w:val="21"/>
-          <w:lang w:eastAsia="en-GB"/>
-          <w14:ligatures w14:val="none"/>
-        </w:rPr>
-        <w:t xml:space="preserve"> to container</w:t>
+        <w:t># Copy package.json and package-lock.json to container</w:t>
       </w:r>
     </w:p>
     <w:p>
@@ -1507,22 +1415,8 @@
           <w:lang w:eastAsia="en-GB"/>
           <w14:ligatures w14:val="none"/>
         </w:rPr>
-        <w:t>package*.</w:t>
-      </w:r>
-      <w:proofErr w:type="spellStart"/>
-      <w:r>
-        <w:rPr>
-          <w:rFonts w:ascii="Consolas" w:eastAsia="Times New Roman" w:hAnsi="Consolas" w:cs="Times New Roman"/>
-          <w:color w:val="9CDCFE"/>
-          <w:kern w:val="0"/>
-          <w:sz w:val="21"/>
-          <w:szCs w:val="21"/>
-          <w:lang w:eastAsia="en-GB"/>
-          <w14:ligatures w14:val="none"/>
-        </w:rPr>
-        <w:t>json</w:t>
-      </w:r>
-      <w:proofErr w:type="spellEnd"/>
+        <w:t>package*.json</w:t>
+      </w:r>
       <w:r>
         <w:rPr>
           <w:rFonts w:ascii="Consolas" w:eastAsia="Times New Roman" w:hAnsi="Consolas" w:cs="Times New Roman"/>
@@ -1631,7 +1525,6 @@
         </w:rPr>
         <w:t xml:space="preserve"> </w:t>
       </w:r>
-      <w:proofErr w:type="spellStart"/>
       <w:r>
         <w:rPr>
           <w:rFonts w:ascii="Consolas" w:eastAsia="Times New Roman" w:hAnsi="Consolas" w:cs="Times New Roman"/>
@@ -1644,7 +1537,6 @@
         </w:rPr>
         <w:t>npm</w:t>
       </w:r>
-      <w:proofErr w:type="spellEnd"/>
       <w:r>
         <w:rPr>
           <w:rFonts w:ascii="Consolas" w:eastAsia="Times New Roman" w:hAnsi="Consolas" w:cs="Times New Roman"/>
@@ -1739,7 +1631,6 @@
           <w:lang w:eastAsia="en-GB"/>
           <w14:ligatures w14:val="none"/>
         </w:rPr>
-        <w:lastRenderedPageBreak/>
         <w:t>COPY</w:t>
       </w:r>
       <w:r>
@@ -2075,16 +1966,11 @@
         <w:t xml:space="preserve">same </w:t>
       </w:r>
       <w:r>
-        <w:t xml:space="preserve">text to the </w:t>
-      </w:r>
-      <w:proofErr w:type="spellStart"/>
-      <w:r>
-        <w:t>Dockerfile</w:t>
+        <w:t>text to the Dockerfile</w:t>
       </w:r>
       <w:r>
         <w:t>s</w:t>
       </w:r>
-      <w:proofErr w:type="spellEnd"/>
       <w:r>
         <w:t xml:space="preserve"> of the </w:t>
       </w:r>
@@ -2217,7 +2103,6 @@
           <w14:ligatures w14:val="none"/>
         </w:rPr>
       </w:pPr>
-      <w:proofErr w:type="spellStart"/>
       <w:r>
         <w:rPr>
           <w:rFonts w:ascii="Consolas" w:eastAsia="Times New Roman" w:hAnsi="Consolas" w:cs="Times New Roman"/>
@@ -2230,7 +2115,6 @@
         </w:rPr>
         <w:t>const</w:t>
       </w:r>
-      <w:proofErr w:type="spellEnd"/>
       <w:r>
         <w:rPr>
           <w:rFonts w:ascii="Consolas" w:eastAsia="Times New Roman" w:hAnsi="Consolas" w:cs="Times New Roman"/>
@@ -2357,7 +2241,6 @@
           <w14:ligatures w14:val="none"/>
         </w:rPr>
       </w:pPr>
-      <w:proofErr w:type="spellStart"/>
       <w:r>
         <w:rPr>
           <w:rFonts w:ascii="Consolas" w:eastAsia="Times New Roman" w:hAnsi="Consolas" w:cs="Times New Roman"/>
@@ -2370,7 +2253,6 @@
         </w:rPr>
         <w:t>const</w:t>
       </w:r>
-      <w:proofErr w:type="spellEnd"/>
       <w:r>
         <w:rPr>
           <w:rFonts w:ascii="Consolas" w:eastAsia="Times New Roman" w:hAnsi="Consolas" w:cs="Times New Roman"/>
@@ -2473,7 +2355,6 @@
           <w14:ligatures w14:val="none"/>
         </w:rPr>
       </w:pPr>
-      <w:proofErr w:type="spellStart"/>
       <w:r>
         <w:rPr>
           <w:rFonts w:ascii="Consolas" w:eastAsia="Times New Roman" w:hAnsi="Consolas" w:cs="Times New Roman"/>
@@ -2486,7 +2367,6 @@
         </w:rPr>
         <w:t>const</w:t>
       </w:r>
-      <w:proofErr w:type="spellEnd"/>
       <w:r>
         <w:rPr>
           <w:rFonts w:ascii="Consolas" w:eastAsia="Times New Roman" w:hAnsi="Consolas" w:cs="Times New Roman"/>
@@ -2547,7 +2427,6 @@
         </w:rPr>
         <w:t xml:space="preserve"> </w:t>
       </w:r>
-      <w:proofErr w:type="spellStart"/>
       <w:r>
         <w:rPr>
           <w:rFonts w:ascii="Consolas" w:eastAsia="Times New Roman" w:hAnsi="Consolas" w:cs="Times New Roman"/>
@@ -2608,7 +2487,6 @@
         </w:rPr>
         <w:t>PORT</w:t>
       </w:r>
-      <w:proofErr w:type="spellEnd"/>
       <w:r>
         <w:rPr>
           <w:rFonts w:ascii="Consolas" w:eastAsia="Times New Roman" w:hAnsi="Consolas" w:cs="Times New Roman"/>
@@ -2735,7 +2613,6 @@
           <w14:ligatures w14:val="none"/>
         </w:rPr>
       </w:pPr>
-      <w:proofErr w:type="spellStart"/>
       <w:r>
         <w:rPr>
           <w:rFonts w:ascii="Consolas" w:eastAsia="Times New Roman" w:hAnsi="Consolas" w:cs="Times New Roman"/>
@@ -2748,7 +2625,6 @@
         </w:rPr>
         <w:t>const</w:t>
       </w:r>
-      <w:proofErr w:type="spellEnd"/>
       <w:r>
         <w:rPr>
           <w:rFonts w:ascii="Consolas" w:eastAsia="Times New Roman" w:hAnsi="Consolas" w:cs="Times New Roman"/>
@@ -2887,7 +2763,6 @@
         </w:rPr>
         <w:t xml:space="preserve">, </w:t>
       </w:r>
-      <w:proofErr w:type="spellStart"/>
       <w:r>
         <w:rPr>
           <w:rFonts w:ascii="Consolas" w:eastAsia="Times New Roman" w:hAnsi="Consolas" w:cs="Times New Roman"/>
@@ -2898,20 +2773,7 @@
           <w:lang w:eastAsia="en-GB"/>
           <w14:ligatures w14:val="none"/>
         </w:rPr>
-        <w:t>productId</w:t>
-      </w:r>
-      <w:proofErr w:type="spellEnd"/>
-      <w:r>
-        <w:rPr>
-          <w:rFonts w:ascii="Consolas" w:eastAsia="Times New Roman" w:hAnsi="Consolas" w:cs="Times New Roman"/>
-          <w:color w:val="9CDCFE"/>
-          <w:kern w:val="0"/>
-          <w:sz w:val="21"/>
-          <w:szCs w:val="21"/>
-          <w:lang w:eastAsia="en-GB"/>
-          <w14:ligatures w14:val="none"/>
-        </w:rPr>
-        <w:t>:</w:t>
+        <w:t>productId:</w:t>
       </w:r>
       <w:r>
         <w:rPr>
@@ -3075,7 +2937,6 @@
         </w:rPr>
         <w:t xml:space="preserve">, </w:t>
       </w:r>
-      <w:proofErr w:type="spellStart"/>
       <w:r>
         <w:rPr>
           <w:rFonts w:ascii="Consolas" w:eastAsia="Times New Roman" w:hAnsi="Consolas" w:cs="Times New Roman"/>
@@ -3086,20 +2947,7 @@
           <w:lang w:eastAsia="en-GB"/>
           <w14:ligatures w14:val="none"/>
         </w:rPr>
-        <w:t>productId</w:t>
-      </w:r>
-      <w:proofErr w:type="spellEnd"/>
-      <w:r>
-        <w:rPr>
-          <w:rFonts w:ascii="Consolas" w:eastAsia="Times New Roman" w:hAnsi="Consolas" w:cs="Times New Roman"/>
-          <w:color w:val="9CDCFE"/>
-          <w:kern w:val="0"/>
-          <w:sz w:val="21"/>
-          <w:szCs w:val="21"/>
-          <w:lang w:eastAsia="en-GB"/>
-          <w14:ligatures w14:val="none"/>
-        </w:rPr>
-        <w:t>:</w:t>
+        <w:t>productId:</w:t>
       </w:r>
       <w:r>
         <w:rPr>
@@ -3281,7 +3129,6 @@
           <w14:ligatures w14:val="none"/>
         </w:rPr>
       </w:pPr>
-      <w:proofErr w:type="spellStart"/>
       <w:r>
         <w:rPr>
           <w:rFonts w:ascii="Consolas" w:eastAsia="Times New Roman" w:hAnsi="Consolas" w:cs="Times New Roman"/>
@@ -3318,7 +3165,6 @@
         </w:rPr>
         <w:t>get</w:t>
       </w:r>
-      <w:proofErr w:type="spellEnd"/>
       <w:r>
         <w:rPr>
           <w:rFonts w:ascii="Consolas" w:eastAsia="Times New Roman" w:hAnsi="Consolas" w:cs="Times New Roman"/>
@@ -3355,7 +3201,6 @@
         </w:rPr>
         <w:t>, (</w:t>
       </w:r>
-      <w:proofErr w:type="spellStart"/>
       <w:r>
         <w:rPr>
           <w:rFonts w:ascii="Consolas" w:eastAsia="Times New Roman" w:hAnsi="Consolas" w:cs="Times New Roman"/>
@@ -3368,7 +3213,6 @@
         </w:rPr>
         <w:t>req</w:t>
       </w:r>
-      <w:proofErr w:type="spellEnd"/>
       <w:r>
         <w:rPr>
           <w:rFonts w:ascii="Consolas" w:eastAsia="Times New Roman" w:hAnsi="Consolas" w:cs="Times New Roman"/>
@@ -3459,7 +3303,6 @@
         </w:rPr>
         <w:t xml:space="preserve">    </w:t>
       </w:r>
-      <w:proofErr w:type="spellStart"/>
       <w:r>
         <w:rPr>
           <w:rFonts w:ascii="Consolas" w:eastAsia="Times New Roman" w:hAnsi="Consolas" w:cs="Times New Roman"/>
@@ -3496,7 +3339,6 @@
         </w:rPr>
         <w:t>json</w:t>
       </w:r>
-      <w:proofErr w:type="spellEnd"/>
       <w:r>
         <w:rPr>
           <w:rFonts w:ascii="Consolas" w:eastAsia="Times New Roman" w:hAnsi="Consolas" w:cs="Times New Roman"/>
@@ -3629,7 +3471,6 @@
           <w14:ligatures w14:val="none"/>
         </w:rPr>
       </w:pPr>
-      <w:proofErr w:type="spellStart"/>
       <w:r>
         <w:rPr>
           <w:rFonts w:ascii="Consolas" w:eastAsia="Times New Roman" w:hAnsi="Consolas" w:cs="Times New Roman"/>
@@ -3666,7 +3507,6 @@
         </w:rPr>
         <w:t>get</w:t>
       </w:r>
-      <w:proofErr w:type="spellEnd"/>
       <w:r>
         <w:rPr>
           <w:rFonts w:ascii="Consolas" w:eastAsia="Times New Roman" w:hAnsi="Consolas" w:cs="Times New Roman"/>
@@ -3703,7 +3543,6 @@
         </w:rPr>
         <w:t>, (</w:t>
       </w:r>
-      <w:proofErr w:type="spellStart"/>
       <w:r>
         <w:rPr>
           <w:rFonts w:ascii="Consolas" w:eastAsia="Times New Roman" w:hAnsi="Consolas" w:cs="Times New Roman"/>
@@ -3716,7 +3555,6 @@
         </w:rPr>
         <w:t>req</w:t>
       </w:r>
-      <w:proofErr w:type="spellEnd"/>
       <w:r>
         <w:rPr>
           <w:rFonts w:ascii="Consolas" w:eastAsia="Times New Roman" w:hAnsi="Consolas" w:cs="Times New Roman"/>
@@ -3807,7 +3645,6 @@
         </w:rPr>
         <w:t xml:space="preserve">    </w:t>
       </w:r>
-      <w:proofErr w:type="spellStart"/>
       <w:r>
         <w:rPr>
           <w:rFonts w:ascii="Consolas" w:eastAsia="Times New Roman" w:hAnsi="Consolas" w:cs="Times New Roman"/>
@@ -3820,7 +3657,6 @@
         </w:rPr>
         <w:t>const</w:t>
       </w:r>
-      <w:proofErr w:type="spellEnd"/>
       <w:r>
         <w:rPr>
           <w:rFonts w:ascii="Consolas" w:eastAsia="Times New Roman" w:hAnsi="Consolas" w:cs="Times New Roman"/>
@@ -3833,7 +3669,6 @@
         </w:rPr>
         <w:t xml:space="preserve"> </w:t>
       </w:r>
-      <w:proofErr w:type="spellStart"/>
       <w:r>
         <w:rPr>
           <w:rFonts w:ascii="Consolas" w:eastAsia="Times New Roman" w:hAnsi="Consolas" w:cs="Times New Roman"/>
@@ -3846,7 +3681,6 @@
         </w:rPr>
         <w:t>orderId</w:t>
       </w:r>
-      <w:proofErr w:type="spellEnd"/>
       <w:r>
         <w:rPr>
           <w:rFonts w:ascii="Consolas" w:eastAsia="Times New Roman" w:hAnsi="Consolas" w:cs="Times New Roman"/>
@@ -3883,7 +3717,6 @@
         </w:rPr>
         <w:t xml:space="preserve"> </w:t>
       </w:r>
-      <w:proofErr w:type="spellStart"/>
       <w:r>
         <w:rPr>
           <w:rFonts w:ascii="Consolas" w:eastAsia="Times New Roman" w:hAnsi="Consolas" w:cs="Times New Roman"/>
@@ -3896,7 +3729,6 @@
         </w:rPr>
         <w:t>parseInt</w:t>
       </w:r>
-      <w:proofErr w:type="spellEnd"/>
       <w:r>
         <w:rPr>
           <w:rFonts w:ascii="Consolas" w:eastAsia="Times New Roman" w:hAnsi="Consolas" w:cs="Times New Roman"/>
@@ -4011,7 +3843,6 @@
         </w:rPr>
         <w:t xml:space="preserve">    </w:t>
       </w:r>
-      <w:proofErr w:type="spellStart"/>
       <w:r>
         <w:rPr>
           <w:rFonts w:ascii="Consolas" w:eastAsia="Times New Roman" w:hAnsi="Consolas" w:cs="Times New Roman"/>
@@ -4024,7 +3855,6 @@
         </w:rPr>
         <w:t>const</w:t>
       </w:r>
-      <w:proofErr w:type="spellEnd"/>
       <w:r>
         <w:rPr>
           <w:rFonts w:ascii="Consolas" w:eastAsia="Times New Roman" w:hAnsi="Consolas" w:cs="Times New Roman"/>
@@ -4085,7 +3915,6 @@
         </w:rPr>
         <w:t xml:space="preserve"> </w:t>
       </w:r>
-      <w:proofErr w:type="spellStart"/>
       <w:r>
         <w:rPr>
           <w:rFonts w:ascii="Consolas" w:eastAsia="Times New Roman" w:hAnsi="Consolas" w:cs="Times New Roman"/>
@@ -4122,7 +3951,6 @@
         </w:rPr>
         <w:t>find</w:t>
       </w:r>
-      <w:proofErr w:type="spellEnd"/>
       <w:r>
         <w:rPr>
           <w:rFonts w:ascii="Consolas" w:eastAsia="Times New Roman" w:hAnsi="Consolas" w:cs="Times New Roman"/>
@@ -4255,7 +4083,6 @@
         </w:rPr>
         <w:t xml:space="preserve"> </w:t>
       </w:r>
-      <w:proofErr w:type="spellStart"/>
       <w:r>
         <w:rPr>
           <w:rFonts w:ascii="Consolas" w:eastAsia="Times New Roman" w:hAnsi="Consolas" w:cs="Times New Roman"/>
@@ -4268,7 +4095,6 @@
         </w:rPr>
         <w:t>orderId</w:t>
       </w:r>
-      <w:proofErr w:type="spellEnd"/>
       <w:r>
         <w:rPr>
           <w:rFonts w:ascii="Consolas" w:eastAsia="Times New Roman" w:hAnsi="Consolas" w:cs="Times New Roman"/>
@@ -4389,7 +4215,6 @@
         </w:rPr>
         <w:t xml:space="preserve">        </w:t>
       </w:r>
-      <w:proofErr w:type="spellStart"/>
       <w:r>
         <w:rPr>
           <w:rFonts w:ascii="Consolas" w:eastAsia="Times New Roman" w:hAnsi="Consolas" w:cs="Times New Roman"/>
@@ -4426,7 +4251,6 @@
         </w:rPr>
         <w:t>json</w:t>
       </w:r>
-      <w:proofErr w:type="spellEnd"/>
       <w:r>
         <w:rPr>
           <w:rFonts w:ascii="Consolas" w:eastAsia="Times New Roman" w:hAnsi="Consolas" w:cs="Times New Roman"/>
@@ -4547,7 +4371,6 @@
         </w:rPr>
         <w:t xml:space="preserve">        </w:t>
       </w:r>
-      <w:proofErr w:type="spellStart"/>
       <w:r>
         <w:rPr>
           <w:rFonts w:ascii="Consolas" w:eastAsia="Times New Roman" w:hAnsi="Consolas" w:cs="Times New Roman"/>
@@ -4584,7 +4407,6 @@
         </w:rPr>
         <w:t>status</w:t>
       </w:r>
-      <w:proofErr w:type="spellEnd"/>
       <w:r>
         <w:rPr>
           <w:rFonts w:ascii="Consolas" w:eastAsia="Times New Roman" w:hAnsi="Consolas" w:cs="Times New Roman"/>
@@ -4621,7 +4443,6 @@
         </w:rPr>
         <w:t>).</w:t>
       </w:r>
-      <w:proofErr w:type="spellStart"/>
       <w:r>
         <w:rPr>
           <w:rFonts w:ascii="Consolas" w:eastAsia="Times New Roman" w:hAnsi="Consolas" w:cs="Times New Roman"/>
@@ -4634,7 +4455,6 @@
         </w:rPr>
         <w:t>json</w:t>
       </w:r>
-      <w:proofErr w:type="spellEnd"/>
       <w:r>
         <w:rPr>
           <w:rFonts w:ascii="Consolas" w:eastAsia="Times New Roman" w:hAnsi="Consolas" w:cs="Times New Roman"/>
@@ -4821,7 +4641,6 @@
           <w14:ligatures w14:val="none"/>
         </w:rPr>
       </w:pPr>
-      <w:proofErr w:type="spellStart"/>
       <w:r>
         <w:rPr>
           <w:rFonts w:ascii="Consolas" w:eastAsia="Times New Roman" w:hAnsi="Consolas" w:cs="Times New Roman"/>
@@ -4858,7 +4677,6 @@
         </w:rPr>
         <w:t>listen</w:t>
       </w:r>
-      <w:proofErr w:type="spellEnd"/>
       <w:r>
         <w:rPr>
           <w:rFonts w:ascii="Consolas" w:eastAsia="Times New Roman" w:hAnsi="Consolas" w:cs="Times New Roman"/>
@@ -5124,7 +4942,6 @@
         <w:ind w:left="714" w:hanging="357"/>
       </w:pPr>
       <w:r>
-        <w:lastRenderedPageBreak/>
         <w:t xml:space="preserve">Copy the following text to the </w:t>
       </w:r>
       <w:r>
@@ -5220,7 +5037,6 @@
           <w14:ligatures w14:val="none"/>
         </w:rPr>
       </w:pPr>
-      <w:proofErr w:type="spellStart"/>
       <w:r>
         <w:rPr>
           <w:rFonts w:ascii="Consolas" w:eastAsia="Times New Roman" w:hAnsi="Consolas" w:cs="Times New Roman"/>
@@ -5233,7 +5049,6 @@
         </w:rPr>
         <w:t>const</w:t>
       </w:r>
-      <w:proofErr w:type="spellEnd"/>
       <w:r>
         <w:rPr>
           <w:rFonts w:ascii="Consolas" w:eastAsia="Times New Roman" w:hAnsi="Consolas" w:cs="Times New Roman"/>
@@ -5359,7 +5174,6 @@
           <w14:ligatures w14:val="none"/>
         </w:rPr>
       </w:pPr>
-      <w:proofErr w:type="spellStart"/>
       <w:r>
         <w:rPr>
           <w:rFonts w:ascii="Consolas" w:eastAsia="Times New Roman" w:hAnsi="Consolas" w:cs="Times New Roman"/>
@@ -5372,7 +5186,6 @@
         </w:rPr>
         <w:t>const</w:t>
       </w:r>
-      <w:proofErr w:type="spellEnd"/>
       <w:r>
         <w:rPr>
           <w:rFonts w:ascii="Consolas" w:eastAsia="Times New Roman" w:hAnsi="Consolas" w:cs="Times New Roman"/>
@@ -5474,7 +5287,6 @@
           <w14:ligatures w14:val="none"/>
         </w:rPr>
       </w:pPr>
-      <w:proofErr w:type="spellStart"/>
       <w:r>
         <w:rPr>
           <w:rFonts w:ascii="Consolas" w:eastAsia="Times New Roman" w:hAnsi="Consolas" w:cs="Times New Roman"/>
@@ -5487,7 +5299,6 @@
         </w:rPr>
         <w:t>const</w:t>
       </w:r>
-      <w:proofErr w:type="spellEnd"/>
       <w:r>
         <w:rPr>
           <w:rFonts w:ascii="Consolas" w:eastAsia="Times New Roman" w:hAnsi="Consolas" w:cs="Times New Roman"/>
@@ -5548,7 +5359,6 @@
         </w:rPr>
         <w:t xml:space="preserve"> </w:t>
       </w:r>
-      <w:proofErr w:type="spellStart"/>
       <w:r>
         <w:rPr>
           <w:rFonts w:ascii="Consolas" w:eastAsia="Times New Roman" w:hAnsi="Consolas" w:cs="Times New Roman"/>
@@ -5609,7 +5419,6 @@
         </w:rPr>
         <w:t>PORT</w:t>
       </w:r>
-      <w:proofErr w:type="spellEnd"/>
       <w:r>
         <w:rPr>
           <w:rFonts w:ascii="Consolas" w:eastAsia="Times New Roman" w:hAnsi="Consolas" w:cs="Times New Roman"/>
@@ -5733,7 +5542,6 @@
           <w14:ligatures w14:val="none"/>
         </w:rPr>
       </w:pPr>
-      <w:proofErr w:type="spellStart"/>
       <w:r>
         <w:rPr>
           <w:rFonts w:ascii="Consolas" w:eastAsia="Times New Roman" w:hAnsi="Consolas" w:cs="Times New Roman"/>
@@ -5746,7 +5554,6 @@
         </w:rPr>
         <w:t>const</w:t>
       </w:r>
-      <w:proofErr w:type="spellEnd"/>
       <w:r>
         <w:rPr>
           <w:rFonts w:ascii="Consolas" w:eastAsia="Times New Roman" w:hAnsi="Consolas" w:cs="Times New Roman"/>
@@ -6418,7 +6225,6 @@
           <w14:ligatures w14:val="none"/>
         </w:rPr>
       </w:pPr>
-      <w:proofErr w:type="spellStart"/>
       <w:r>
         <w:rPr>
           <w:rFonts w:ascii="Consolas" w:eastAsia="Times New Roman" w:hAnsi="Consolas" w:cs="Times New Roman"/>
@@ -6455,7 +6261,6 @@
         </w:rPr>
         <w:t>get</w:t>
       </w:r>
-      <w:proofErr w:type="spellEnd"/>
       <w:r>
         <w:rPr>
           <w:rFonts w:ascii="Consolas" w:eastAsia="Times New Roman" w:hAnsi="Consolas" w:cs="Times New Roman"/>
@@ -6492,7 +6297,6 @@
         </w:rPr>
         <w:t>, (</w:t>
       </w:r>
-      <w:proofErr w:type="spellStart"/>
       <w:r>
         <w:rPr>
           <w:rFonts w:ascii="Consolas" w:eastAsia="Times New Roman" w:hAnsi="Consolas" w:cs="Times New Roman"/>
@@ -6505,7 +6309,6 @@
         </w:rPr>
         <w:t>req</w:t>
       </w:r>
-      <w:proofErr w:type="spellEnd"/>
       <w:r>
         <w:rPr>
           <w:rFonts w:ascii="Consolas" w:eastAsia="Times New Roman" w:hAnsi="Consolas" w:cs="Times New Roman"/>
@@ -6595,7 +6398,6 @@
         </w:rPr>
         <w:t xml:space="preserve">    </w:t>
       </w:r>
-      <w:proofErr w:type="spellStart"/>
       <w:r>
         <w:rPr>
           <w:rFonts w:ascii="Consolas" w:eastAsia="Times New Roman" w:hAnsi="Consolas" w:cs="Times New Roman"/>
@@ -6632,7 +6434,6 @@
         </w:rPr>
         <w:t>json</w:t>
       </w:r>
-      <w:proofErr w:type="spellEnd"/>
       <w:r>
         <w:rPr>
           <w:rFonts w:ascii="Consolas" w:eastAsia="Times New Roman" w:hAnsi="Consolas" w:cs="Times New Roman"/>
@@ -6758,7 +6559,6 @@
           <w14:ligatures w14:val="none"/>
         </w:rPr>
       </w:pPr>
-      <w:proofErr w:type="spellStart"/>
       <w:r>
         <w:rPr>
           <w:rFonts w:ascii="Consolas" w:eastAsia="Times New Roman" w:hAnsi="Consolas" w:cs="Times New Roman"/>
@@ -6795,7 +6595,6 @@
         </w:rPr>
         <w:t>get</w:t>
       </w:r>
-      <w:proofErr w:type="spellEnd"/>
       <w:r>
         <w:rPr>
           <w:rFonts w:ascii="Consolas" w:eastAsia="Times New Roman" w:hAnsi="Consolas" w:cs="Times New Roman"/>
@@ -6832,7 +6631,6 @@
         </w:rPr>
         <w:t>, (</w:t>
       </w:r>
-      <w:proofErr w:type="spellStart"/>
       <w:r>
         <w:rPr>
           <w:rFonts w:ascii="Consolas" w:eastAsia="Times New Roman" w:hAnsi="Consolas" w:cs="Times New Roman"/>
@@ -6845,7 +6643,6 @@
         </w:rPr>
         <w:t>req</w:t>
       </w:r>
-      <w:proofErr w:type="spellEnd"/>
       <w:r>
         <w:rPr>
           <w:rFonts w:ascii="Consolas" w:eastAsia="Times New Roman" w:hAnsi="Consolas" w:cs="Times New Roman"/>
@@ -6934,7 +6731,6 @@
         </w:rPr>
         <w:t xml:space="preserve">    </w:t>
       </w:r>
-      <w:proofErr w:type="spellStart"/>
       <w:r>
         <w:rPr>
           <w:rFonts w:ascii="Consolas" w:eastAsia="Times New Roman" w:hAnsi="Consolas" w:cs="Times New Roman"/>
@@ -6947,7 +6743,6 @@
         </w:rPr>
         <w:t>const</w:t>
       </w:r>
-      <w:proofErr w:type="spellEnd"/>
       <w:r>
         <w:rPr>
           <w:rFonts w:ascii="Consolas" w:eastAsia="Times New Roman" w:hAnsi="Consolas" w:cs="Times New Roman"/>
@@ -6960,7 +6755,6 @@
         </w:rPr>
         <w:t xml:space="preserve"> </w:t>
       </w:r>
-      <w:proofErr w:type="spellStart"/>
       <w:r>
         <w:rPr>
           <w:rFonts w:ascii="Consolas" w:eastAsia="Times New Roman" w:hAnsi="Consolas" w:cs="Times New Roman"/>
@@ -6973,7 +6767,6 @@
         </w:rPr>
         <w:t>productId</w:t>
       </w:r>
-      <w:proofErr w:type="spellEnd"/>
       <w:r>
         <w:rPr>
           <w:rFonts w:ascii="Consolas" w:eastAsia="Times New Roman" w:hAnsi="Consolas" w:cs="Times New Roman"/>
@@ -7010,7 +6803,6 @@
         </w:rPr>
         <w:t xml:space="preserve"> </w:t>
       </w:r>
-      <w:proofErr w:type="spellStart"/>
       <w:r>
         <w:rPr>
           <w:rFonts w:ascii="Consolas" w:eastAsia="Times New Roman" w:hAnsi="Consolas" w:cs="Times New Roman"/>
@@ -7023,7 +6815,6 @@
         </w:rPr>
         <w:t>parseInt</w:t>
       </w:r>
-      <w:proofErr w:type="spellEnd"/>
       <w:r>
         <w:rPr>
           <w:rFonts w:ascii="Consolas" w:eastAsia="Times New Roman" w:hAnsi="Consolas" w:cs="Times New Roman"/>
@@ -7136,7 +6927,6 @@
         </w:rPr>
         <w:t xml:space="preserve">    </w:t>
       </w:r>
-      <w:proofErr w:type="spellStart"/>
       <w:r>
         <w:rPr>
           <w:rFonts w:ascii="Consolas" w:eastAsia="Times New Roman" w:hAnsi="Consolas" w:cs="Times New Roman"/>
@@ -7149,7 +6939,6 @@
         </w:rPr>
         <w:t>const</w:t>
       </w:r>
-      <w:proofErr w:type="spellEnd"/>
       <w:r>
         <w:rPr>
           <w:rFonts w:ascii="Consolas" w:eastAsia="Times New Roman" w:hAnsi="Consolas" w:cs="Times New Roman"/>
@@ -7210,7 +6999,6 @@
         </w:rPr>
         <w:t xml:space="preserve"> </w:t>
       </w:r>
-      <w:proofErr w:type="spellStart"/>
       <w:r>
         <w:rPr>
           <w:rFonts w:ascii="Consolas" w:eastAsia="Times New Roman" w:hAnsi="Consolas" w:cs="Times New Roman"/>
@@ -7247,7 +7035,6 @@
         </w:rPr>
         <w:t>find</w:t>
       </w:r>
-      <w:proofErr w:type="spellEnd"/>
       <w:r>
         <w:rPr>
           <w:rFonts w:ascii="Consolas" w:eastAsia="Times New Roman" w:hAnsi="Consolas" w:cs="Times New Roman"/>
@@ -7380,7 +7167,6 @@
         </w:rPr>
         <w:t xml:space="preserve"> </w:t>
       </w:r>
-      <w:proofErr w:type="spellStart"/>
       <w:r>
         <w:rPr>
           <w:rFonts w:ascii="Consolas" w:eastAsia="Times New Roman" w:hAnsi="Consolas" w:cs="Times New Roman"/>
@@ -7393,7 +7179,6 @@
         </w:rPr>
         <w:t>productId</w:t>
       </w:r>
-      <w:proofErr w:type="spellEnd"/>
       <w:r>
         <w:rPr>
           <w:rFonts w:ascii="Consolas" w:eastAsia="Times New Roman" w:hAnsi="Consolas" w:cs="Times New Roman"/>
@@ -7510,7 +7295,6 @@
         </w:rPr>
         <w:t xml:space="preserve">        </w:t>
       </w:r>
-      <w:proofErr w:type="spellStart"/>
       <w:r>
         <w:rPr>
           <w:rFonts w:ascii="Consolas" w:eastAsia="Times New Roman" w:hAnsi="Consolas" w:cs="Times New Roman"/>
@@ -7547,7 +7331,6 @@
         </w:rPr>
         <w:t>json</w:t>
       </w:r>
-      <w:proofErr w:type="spellEnd"/>
       <w:r>
         <w:rPr>
           <w:rFonts w:ascii="Consolas" w:eastAsia="Times New Roman" w:hAnsi="Consolas" w:cs="Times New Roman"/>
@@ -7664,7 +7447,6 @@
         </w:rPr>
         <w:t xml:space="preserve">        </w:t>
       </w:r>
-      <w:proofErr w:type="spellStart"/>
       <w:r>
         <w:rPr>
           <w:rFonts w:ascii="Consolas" w:eastAsia="Times New Roman" w:hAnsi="Consolas" w:cs="Times New Roman"/>
@@ -7701,7 +7483,6 @@
         </w:rPr>
         <w:t>status</w:t>
       </w:r>
-      <w:proofErr w:type="spellEnd"/>
       <w:r>
         <w:rPr>
           <w:rFonts w:ascii="Consolas" w:eastAsia="Times New Roman" w:hAnsi="Consolas" w:cs="Times New Roman"/>
@@ -7738,7 +7519,6 @@
         </w:rPr>
         <w:t>).</w:t>
       </w:r>
-      <w:proofErr w:type="spellStart"/>
       <w:r>
         <w:rPr>
           <w:rFonts w:ascii="Consolas" w:eastAsia="Times New Roman" w:hAnsi="Consolas" w:cs="Times New Roman"/>
@@ -7751,7 +7531,6 @@
         </w:rPr>
         <w:t>json</w:t>
       </w:r>
-      <w:proofErr w:type="spellEnd"/>
       <w:r>
         <w:rPr>
           <w:rFonts w:ascii="Consolas" w:eastAsia="Times New Roman" w:hAnsi="Consolas" w:cs="Times New Roman"/>
@@ -7928,7 +7707,6 @@
           <w14:ligatures w14:val="none"/>
         </w:rPr>
       </w:pPr>
-      <w:proofErr w:type="spellStart"/>
       <w:r>
         <w:rPr>
           <w:rFonts w:ascii="Consolas" w:eastAsia="Times New Roman" w:hAnsi="Consolas" w:cs="Times New Roman"/>
@@ -7965,7 +7743,6 @@
         </w:rPr>
         <w:t>listen</w:t>
       </w:r>
-      <w:proofErr w:type="spellEnd"/>
       <w:r>
         <w:rPr>
           <w:rFonts w:ascii="Consolas" w:eastAsia="Times New Roman" w:hAnsi="Consolas" w:cs="Times New Roman"/>
@@ -8232,7 +8009,6 @@
         <w:ind w:left="714" w:hanging="357"/>
       </w:pPr>
       <w:r>
-        <w:lastRenderedPageBreak/>
         <w:t xml:space="preserve">Finally, copy the following text to the </w:t>
       </w:r>
       <w:r>
@@ -8328,7 +8104,6 @@
           <w14:ligatures w14:val="none"/>
         </w:rPr>
       </w:pPr>
-      <w:proofErr w:type="spellStart"/>
       <w:r>
         <w:rPr>
           <w:rFonts w:ascii="Consolas" w:eastAsia="Times New Roman" w:hAnsi="Consolas" w:cs="Times New Roman"/>
@@ -8341,7 +8116,6 @@
         </w:rPr>
         <w:t>const</w:t>
       </w:r>
-      <w:proofErr w:type="spellEnd"/>
       <w:r>
         <w:rPr>
           <w:rFonts w:ascii="Consolas" w:eastAsia="Times New Roman" w:hAnsi="Consolas" w:cs="Times New Roman"/>
@@ -8468,7 +8242,6 @@
           <w14:ligatures w14:val="none"/>
         </w:rPr>
       </w:pPr>
-      <w:proofErr w:type="spellStart"/>
       <w:r>
         <w:rPr>
           <w:rFonts w:ascii="Consolas" w:eastAsia="Times New Roman" w:hAnsi="Consolas" w:cs="Times New Roman"/>
@@ -8481,7 +8254,6 @@
         </w:rPr>
         <w:t>const</w:t>
       </w:r>
-      <w:proofErr w:type="spellEnd"/>
       <w:r>
         <w:rPr>
           <w:rFonts w:ascii="Consolas" w:eastAsia="Times New Roman" w:hAnsi="Consolas" w:cs="Times New Roman"/>
@@ -8584,7 +8356,6 @@
           <w14:ligatures w14:val="none"/>
         </w:rPr>
       </w:pPr>
-      <w:proofErr w:type="spellStart"/>
       <w:r>
         <w:rPr>
           <w:rFonts w:ascii="Consolas" w:eastAsia="Times New Roman" w:hAnsi="Consolas" w:cs="Times New Roman"/>
@@ -8597,7 +8368,6 @@
         </w:rPr>
         <w:t>const</w:t>
       </w:r>
-      <w:proofErr w:type="spellEnd"/>
       <w:r>
         <w:rPr>
           <w:rFonts w:ascii="Consolas" w:eastAsia="Times New Roman" w:hAnsi="Consolas" w:cs="Times New Roman"/>
@@ -8658,7 +8428,6 @@
         </w:rPr>
         <w:t xml:space="preserve"> </w:t>
       </w:r>
-      <w:proofErr w:type="spellStart"/>
       <w:r>
         <w:rPr>
           <w:rFonts w:ascii="Consolas" w:eastAsia="Times New Roman" w:hAnsi="Consolas" w:cs="Times New Roman"/>
@@ -8719,7 +8488,6 @@
         </w:rPr>
         <w:t>PORT</w:t>
       </w:r>
-      <w:proofErr w:type="spellEnd"/>
       <w:r>
         <w:rPr>
           <w:rFonts w:ascii="Consolas" w:eastAsia="Times New Roman" w:hAnsi="Consolas" w:cs="Times New Roman"/>
@@ -8846,7 +8614,6 @@
           <w14:ligatures w14:val="none"/>
         </w:rPr>
       </w:pPr>
-      <w:proofErr w:type="spellStart"/>
       <w:r>
         <w:rPr>
           <w:rFonts w:ascii="Consolas" w:eastAsia="Times New Roman" w:hAnsi="Consolas" w:cs="Times New Roman"/>
@@ -8859,7 +8626,6 @@
         </w:rPr>
         <w:t>const</w:t>
       </w:r>
-      <w:proofErr w:type="spellEnd"/>
       <w:r>
         <w:rPr>
           <w:rFonts w:ascii="Consolas" w:eastAsia="Times New Roman" w:hAnsi="Consolas" w:cs="Times New Roman"/>
@@ -9364,7 +9130,6 @@
           <w14:ligatures w14:val="none"/>
         </w:rPr>
       </w:pPr>
-      <w:proofErr w:type="spellStart"/>
       <w:r>
         <w:rPr>
           <w:rFonts w:ascii="Consolas" w:eastAsia="Times New Roman" w:hAnsi="Consolas" w:cs="Times New Roman"/>
@@ -9401,7 +9166,6 @@
         </w:rPr>
         <w:t>get</w:t>
       </w:r>
-      <w:proofErr w:type="spellEnd"/>
       <w:r>
         <w:rPr>
           <w:rFonts w:ascii="Consolas" w:eastAsia="Times New Roman" w:hAnsi="Consolas" w:cs="Times New Roman"/>
@@ -9438,7 +9202,6 @@
         </w:rPr>
         <w:t>, (</w:t>
       </w:r>
-      <w:proofErr w:type="spellStart"/>
       <w:r>
         <w:rPr>
           <w:rFonts w:ascii="Consolas" w:eastAsia="Times New Roman" w:hAnsi="Consolas" w:cs="Times New Roman"/>
@@ -9451,7 +9214,6 @@
         </w:rPr>
         <w:t>req</w:t>
       </w:r>
-      <w:proofErr w:type="spellEnd"/>
       <w:r>
         <w:rPr>
           <w:rFonts w:ascii="Consolas" w:eastAsia="Times New Roman" w:hAnsi="Consolas" w:cs="Times New Roman"/>
@@ -9542,7 +9304,6 @@
         </w:rPr>
         <w:t xml:space="preserve">    </w:t>
       </w:r>
-      <w:proofErr w:type="spellStart"/>
       <w:r>
         <w:rPr>
           <w:rFonts w:ascii="Consolas" w:eastAsia="Times New Roman" w:hAnsi="Consolas" w:cs="Times New Roman"/>
@@ -9579,7 +9340,6 @@
         </w:rPr>
         <w:t>json</w:t>
       </w:r>
-      <w:proofErr w:type="spellEnd"/>
       <w:r>
         <w:rPr>
           <w:rFonts w:ascii="Consolas" w:eastAsia="Times New Roman" w:hAnsi="Consolas" w:cs="Times New Roman"/>
@@ -9712,7 +9472,6 @@
           <w14:ligatures w14:val="none"/>
         </w:rPr>
       </w:pPr>
-      <w:proofErr w:type="spellStart"/>
       <w:r>
         <w:rPr>
           <w:rFonts w:ascii="Consolas" w:eastAsia="Times New Roman" w:hAnsi="Consolas" w:cs="Times New Roman"/>
@@ -9749,7 +9508,6 @@
         </w:rPr>
         <w:t>get</w:t>
       </w:r>
-      <w:proofErr w:type="spellEnd"/>
       <w:r>
         <w:rPr>
           <w:rFonts w:ascii="Consolas" w:eastAsia="Times New Roman" w:hAnsi="Consolas" w:cs="Times New Roman"/>
@@ -9786,7 +9544,6 @@
         </w:rPr>
         <w:t>, (</w:t>
       </w:r>
-      <w:proofErr w:type="spellStart"/>
       <w:r>
         <w:rPr>
           <w:rFonts w:ascii="Consolas" w:eastAsia="Times New Roman" w:hAnsi="Consolas" w:cs="Times New Roman"/>
@@ -9799,7 +9556,6 @@
         </w:rPr>
         <w:t>req</w:t>
       </w:r>
-      <w:proofErr w:type="spellEnd"/>
       <w:r>
         <w:rPr>
           <w:rFonts w:ascii="Consolas" w:eastAsia="Times New Roman" w:hAnsi="Consolas" w:cs="Times New Roman"/>
@@ -9890,7 +9646,6 @@
         </w:rPr>
         <w:t xml:space="preserve">    </w:t>
       </w:r>
-      <w:proofErr w:type="spellStart"/>
       <w:r>
         <w:rPr>
           <w:rFonts w:ascii="Consolas" w:eastAsia="Times New Roman" w:hAnsi="Consolas" w:cs="Times New Roman"/>
@@ -9903,7 +9658,6 @@
         </w:rPr>
         <w:t>const</w:t>
       </w:r>
-      <w:proofErr w:type="spellEnd"/>
       <w:r>
         <w:rPr>
           <w:rFonts w:ascii="Consolas" w:eastAsia="Times New Roman" w:hAnsi="Consolas" w:cs="Times New Roman"/>
@@ -9916,7 +9670,6 @@
         </w:rPr>
         <w:t xml:space="preserve"> </w:t>
       </w:r>
-      <w:proofErr w:type="spellStart"/>
       <w:r>
         <w:rPr>
           <w:rFonts w:ascii="Consolas" w:eastAsia="Times New Roman" w:hAnsi="Consolas" w:cs="Times New Roman"/>
@@ -9929,7 +9682,6 @@
         </w:rPr>
         <w:t>userId</w:t>
       </w:r>
-      <w:proofErr w:type="spellEnd"/>
       <w:r>
         <w:rPr>
           <w:rFonts w:ascii="Consolas" w:eastAsia="Times New Roman" w:hAnsi="Consolas" w:cs="Times New Roman"/>
@@ -9966,7 +9718,6 @@
         </w:rPr>
         <w:t xml:space="preserve"> </w:t>
       </w:r>
-      <w:proofErr w:type="spellStart"/>
       <w:r>
         <w:rPr>
           <w:rFonts w:ascii="Consolas" w:eastAsia="Times New Roman" w:hAnsi="Consolas" w:cs="Times New Roman"/>
@@ -9979,7 +9730,6 @@
         </w:rPr>
         <w:t>parseInt</w:t>
       </w:r>
-      <w:proofErr w:type="spellEnd"/>
       <w:r>
         <w:rPr>
           <w:rFonts w:ascii="Consolas" w:eastAsia="Times New Roman" w:hAnsi="Consolas" w:cs="Times New Roman"/>
@@ -10094,7 +9844,6 @@
         </w:rPr>
         <w:t xml:space="preserve">    </w:t>
       </w:r>
-      <w:proofErr w:type="spellStart"/>
       <w:r>
         <w:rPr>
           <w:rFonts w:ascii="Consolas" w:eastAsia="Times New Roman" w:hAnsi="Consolas" w:cs="Times New Roman"/>
@@ -10107,7 +9856,6 @@
         </w:rPr>
         <w:t>const</w:t>
       </w:r>
-      <w:proofErr w:type="spellEnd"/>
       <w:r>
         <w:rPr>
           <w:rFonts w:ascii="Consolas" w:eastAsia="Times New Roman" w:hAnsi="Consolas" w:cs="Times New Roman"/>
@@ -10168,7 +9916,6 @@
         </w:rPr>
         <w:t xml:space="preserve"> </w:t>
       </w:r>
-      <w:proofErr w:type="spellStart"/>
       <w:r>
         <w:rPr>
           <w:rFonts w:ascii="Consolas" w:eastAsia="Times New Roman" w:hAnsi="Consolas" w:cs="Times New Roman"/>
@@ -10205,7 +9952,6 @@
         </w:rPr>
         <w:t>find</w:t>
       </w:r>
-      <w:proofErr w:type="spellEnd"/>
       <w:r>
         <w:rPr>
           <w:rFonts w:ascii="Consolas" w:eastAsia="Times New Roman" w:hAnsi="Consolas" w:cs="Times New Roman"/>
@@ -10338,7 +10084,6 @@
         </w:rPr>
         <w:t xml:space="preserve"> </w:t>
       </w:r>
-      <w:proofErr w:type="spellStart"/>
       <w:r>
         <w:rPr>
           <w:rFonts w:ascii="Consolas" w:eastAsia="Times New Roman" w:hAnsi="Consolas" w:cs="Times New Roman"/>
@@ -10351,7 +10096,6 @@
         </w:rPr>
         <w:t>userId</w:t>
       </w:r>
-      <w:proofErr w:type="spellEnd"/>
       <w:r>
         <w:rPr>
           <w:rFonts w:ascii="Consolas" w:eastAsia="Times New Roman" w:hAnsi="Consolas" w:cs="Times New Roman"/>
@@ -10472,7 +10216,6 @@
         </w:rPr>
         <w:t xml:space="preserve">        </w:t>
       </w:r>
-      <w:proofErr w:type="spellStart"/>
       <w:r>
         <w:rPr>
           <w:rFonts w:ascii="Consolas" w:eastAsia="Times New Roman" w:hAnsi="Consolas" w:cs="Times New Roman"/>
@@ -10509,7 +10252,6 @@
         </w:rPr>
         <w:t>json</w:t>
       </w:r>
-      <w:proofErr w:type="spellEnd"/>
       <w:r>
         <w:rPr>
           <w:rFonts w:ascii="Consolas" w:eastAsia="Times New Roman" w:hAnsi="Consolas" w:cs="Times New Roman"/>
@@ -10630,7 +10372,6 @@
         </w:rPr>
         <w:t xml:space="preserve">        </w:t>
       </w:r>
-      <w:proofErr w:type="spellStart"/>
       <w:r>
         <w:rPr>
           <w:rFonts w:ascii="Consolas" w:eastAsia="Times New Roman" w:hAnsi="Consolas" w:cs="Times New Roman"/>
@@ -10667,7 +10408,6 @@
         </w:rPr>
         <w:t>status</w:t>
       </w:r>
-      <w:proofErr w:type="spellEnd"/>
       <w:r>
         <w:rPr>
           <w:rFonts w:ascii="Consolas" w:eastAsia="Times New Roman" w:hAnsi="Consolas" w:cs="Times New Roman"/>
@@ -10704,7 +10444,6 @@
         </w:rPr>
         <w:t>).</w:t>
       </w:r>
-      <w:proofErr w:type="spellStart"/>
       <w:r>
         <w:rPr>
           <w:rFonts w:ascii="Consolas" w:eastAsia="Times New Roman" w:hAnsi="Consolas" w:cs="Times New Roman"/>
@@ -10717,7 +10456,6 @@
         </w:rPr>
         <w:t>json</w:t>
       </w:r>
-      <w:proofErr w:type="spellEnd"/>
       <w:r>
         <w:rPr>
           <w:rFonts w:ascii="Consolas" w:eastAsia="Times New Roman" w:hAnsi="Consolas" w:cs="Times New Roman"/>
@@ -10904,7 +10642,6 @@
           <w14:ligatures w14:val="none"/>
         </w:rPr>
       </w:pPr>
-      <w:proofErr w:type="spellStart"/>
       <w:r>
         <w:rPr>
           <w:rFonts w:ascii="Consolas" w:eastAsia="Times New Roman" w:hAnsi="Consolas" w:cs="Times New Roman"/>
@@ -10941,7 +10678,6 @@
         </w:rPr>
         <w:t>listen</w:t>
       </w:r>
-      <w:proofErr w:type="spellEnd"/>
       <w:r>
         <w:rPr>
           <w:rFonts w:ascii="Consolas" w:eastAsia="Times New Roman" w:hAnsi="Consolas" w:cs="Times New Roman"/>
@@ -11214,7 +10950,6 @@
         </w:numPr>
       </w:pPr>
       <w:r>
-        <w:lastRenderedPageBreak/>
         <w:t>Let’s build our dockers and run them on a network by running the following command (start from the root folder, above the product-service folder)</w:t>
       </w:r>
       <w:r>
@@ -11833,22 +11568,7 @@
           <w:lang w:eastAsia="en-GB"/>
           <w14:ligatures w14:val="none"/>
         </w:rPr>
-        <w:t xml:space="preserve"> -d --name user-service --network ecommerce-network </w:t>
-      </w:r>
-      <w:r>
-        <w:rPr>
-          <w:rFonts w:ascii="Consolas" w:eastAsia="Times New Roman" w:hAnsi="Consolas" w:cs="Times New Roman"/>
-          <w:b/>
-          <w:bCs/>
-          <w:color w:val="CCCCCC"/>
-          <w:kern w:val="0"/>
-          <w:sz w:val="24"/>
-          <w:szCs w:val="24"/>
-          <w:lang w:eastAsia="en-GB"/>
-          <w14:ligatures w14:val="none"/>
-        </w:rPr>
-        <w:br/>
-        <w:t>user-service</w:t>
+        <w:t xml:space="preserve"> -d --name user-service --network ecommerce-network user-service</w:t>
       </w:r>
       <w:r>
         <w:rPr>
@@ -12239,19 +11959,7 @@
           <w14:ligatures w14:val="none"/>
         </w:rPr>
         <w:br/>
-        <w:t xml:space="preserve">From the inside of the user-service, make a call to one of the other </w:t>
-      </w:r>
-      <w:r>
-        <w:rPr>
-          <w:rFonts w:ascii="Calibri" w:eastAsia="Times New Roman" w:hAnsi="Calibri" w:cs="Calibri"/>
-          <w:kern w:val="0"/>
-          <w:sz w:val="28"/>
-          <w:szCs w:val="28"/>
-          <w:lang w:eastAsia="en-GB"/>
-          <w14:ligatures w14:val="none"/>
-        </w:rPr>
-        <w:lastRenderedPageBreak/>
-        <w:t>services like:</w:t>
+        <w:t>From the inside of the user-service, make a call to one of the other services like:</w:t>
       </w:r>
       <w:r>
         <w:rPr>
@@ -12861,7 +12569,7 @@
 </file>
 
 <file path=word/endnotes.xml><?xml version="1.0" encoding="utf-8"?>
-<w:endnotes xmlns:wpc="http://schemas.microsoft.com/office/word/2010/wordprocessingCanvas" xmlns:cx="http://schemas.microsoft.com/office/drawing/2014/chartex" xmlns:cx1="http://schemas.microsoft.com/office/drawing/2015/9/8/chartex" xmlns:cx2="http://schemas.microsoft.com/office/drawing/2015/10/21/chartex" xmlns:cx3="http://schemas.microsoft.com/office/drawing/2016/5/9/chartex" xmlns:cx4="http://schemas.microsoft.com/office/drawing/2016/5/10/chartex" xmlns:cx5="http://schemas.microsoft.com/office/drawing/2016/5/11/chartex" xmlns:cx6="http://schemas.microsoft.com/office/drawing/2016/5/12/chartex" xmlns:cx7="http://schemas.microsoft.com/office/drawing/2016/5/13/chartex" xmlns:cx8="http://schemas.microsoft.com/office/drawing/2016/5/14/chartex" xmlns:mc="http://schemas.openxmlformats.org/markup-compatibility/2006" xmlns:aink="http://schemas.microsoft.com/office/drawing/2016/ink" xmlns:am3d="http://schemas.microsoft.com/office/drawing/2017/model3d" xmlns:o="urn:schemas-microsoft-com:office:office" xmlns:oel="http://schemas.microsoft.com/office/2019/extlst" xmlns:r="http://schemas.openxmlformats.org/officeDocument/2006/relationships" xmlns:m="http://schemas.openxmlformats.org/officeDocument/2006/math" xmlns:v="urn:schemas-microsoft-com:vml" xmlns:wp14="http://schemas.microsoft.com/office/word/2010/wordprocessingDrawing" xmlns:wp="http://schemas.openxmlformats.org/drawingml/2006/wordprocessingDrawing" xmlns:w10="urn:schemas-microsoft-com:office:word" xmlns:w="http://schemas.openxmlformats.org/wordprocessingml/2006/main" xmlns:w14="http://schemas.microsoft.com/office/word/2010/wordml" xmlns:w15="http://schemas.microsoft.com/office/word/2012/wordml" xmlns:w16cex="http://schemas.microsoft.com/office/word/2018/wordml/cex" xmlns:w16cid="http://schemas.microsoft.com/office/word/2016/wordml/cid" xmlns:w16="http://schemas.microsoft.com/office/word/2018/wordml" xmlns:w16du="http://schemas.microsoft.com/office/word/2023/wordml/word16du" xmlns:w16sdtdh="http://schemas.microsoft.com/office/word/2020/wordml/sdtdatahash" xmlns:w16se="http://schemas.microsoft.com/office/word/2015/wordml/symex" xmlns:wpg="http://schemas.microsoft.com/office/word/2010/wordprocessingGroup" xmlns:wpi="http://schemas.microsoft.com/office/word/2010/wordprocessingInk" xmlns:wne="http://schemas.microsoft.com/office/word/2006/wordml" xmlns:wps="http://schemas.microsoft.com/office/word/2010/wordprocessingShape" mc:Ignorable="w14 w15 w16se w16cid w16 w16cex w16sdtdh w16du wp14">
+<w:endnotes xmlns:wpc="http://schemas.microsoft.com/office/word/2010/wordprocessingCanvas" xmlns:cx="http://schemas.microsoft.com/office/drawing/2014/chartex" xmlns:cx1="http://schemas.microsoft.com/office/drawing/2015/9/8/chartex" xmlns:cx2="http://schemas.microsoft.com/office/drawing/2015/10/21/chartex" xmlns:cx3="http://schemas.microsoft.com/office/drawing/2016/5/9/chartex" xmlns:cx4="http://schemas.microsoft.com/office/drawing/2016/5/10/chartex" xmlns:cx5="http://schemas.microsoft.com/office/drawing/2016/5/11/chartex" xmlns:cx6="http://schemas.microsoft.com/office/drawing/2016/5/12/chartex" xmlns:cx7="http://schemas.microsoft.com/office/drawing/2016/5/13/chartex" xmlns:cx8="http://schemas.microsoft.com/office/drawing/2016/5/14/chartex" xmlns:mc="http://schemas.openxmlformats.org/markup-compatibility/2006" xmlns:aink="http://schemas.microsoft.com/office/drawing/2016/ink" xmlns:am3d="http://schemas.microsoft.com/office/drawing/2017/model3d" xmlns:o="urn:schemas-microsoft-com:office:office" xmlns:oel="http://schemas.microsoft.com/office/2019/extlst" xmlns:r="http://schemas.openxmlformats.org/officeDocument/2006/relationships" xmlns:m="http://schemas.openxmlformats.org/officeDocument/2006/math" xmlns:v="urn:schemas-microsoft-com:vml" xmlns:wp14="http://schemas.microsoft.com/office/word/2010/wordprocessingDrawing" xmlns:wp="http://schemas.openxmlformats.org/drawingml/2006/wordprocessingDrawing" xmlns:w10="urn:schemas-microsoft-com:office:word" xmlns:w="http://schemas.openxmlformats.org/wordprocessingml/2006/main" xmlns:w14="http://schemas.microsoft.com/office/word/2010/wordml" xmlns:w15="http://schemas.microsoft.com/office/word/2012/wordml" xmlns:w16cex="http://schemas.microsoft.com/office/word/2018/wordml/cex" xmlns:w16cid="http://schemas.microsoft.com/office/word/2016/wordml/cid" xmlns:w16="http://schemas.microsoft.com/office/word/2018/wordml" xmlns:w16du="http://schemas.microsoft.com/office/word/2023/wordml/word16du" xmlns:w16sdtdh="http://schemas.microsoft.com/office/word/2020/wordml/sdtdatahash" xmlns:w16sdtfl="http://schemas.microsoft.com/office/word/2024/wordml/sdtformatlock" xmlns:w16se="http://schemas.microsoft.com/office/word/2015/wordml/symex" xmlns:wpg="http://schemas.microsoft.com/office/word/2010/wordprocessingGroup" xmlns:wpi="http://schemas.microsoft.com/office/word/2010/wordprocessingInk" xmlns:wne="http://schemas.microsoft.com/office/word/2006/wordml" xmlns:wps="http://schemas.microsoft.com/office/word/2010/wordprocessingShape" mc:Ignorable="w14 w15 w16se w16cid w16 w16cex w16sdtdh w16sdtfl w16du wp14">
   <w:endnote w:type="separator" w:id="-1">
     <w:p>
       <w:pPr>
@@ -12886,7 +12594,7 @@
 </file>
 
 <file path=word/footnotes.xml><?xml version="1.0" encoding="utf-8"?>
-<w:footnotes xmlns:wpc="http://schemas.microsoft.com/office/word/2010/wordprocessingCanvas" xmlns:cx="http://schemas.microsoft.com/office/drawing/2014/chartex" xmlns:cx1="http://schemas.microsoft.com/office/drawing/2015/9/8/chartex" xmlns:cx2="http://schemas.microsoft.com/office/drawing/2015/10/21/chartex" xmlns:cx3="http://schemas.microsoft.com/office/drawing/2016/5/9/chartex" xmlns:cx4="http://schemas.microsoft.com/office/drawing/2016/5/10/chartex" xmlns:cx5="http://schemas.microsoft.com/office/drawing/2016/5/11/chartex" xmlns:cx6="http://schemas.microsoft.com/office/drawing/2016/5/12/chartex" xmlns:cx7="http://schemas.microsoft.com/office/drawing/2016/5/13/chartex" xmlns:cx8="http://schemas.microsoft.com/office/drawing/2016/5/14/chartex" xmlns:mc="http://schemas.openxmlformats.org/markup-compatibility/2006" xmlns:aink="http://schemas.microsoft.com/office/drawing/2016/ink" xmlns:am3d="http://schemas.microsoft.com/office/drawing/2017/model3d" xmlns:o="urn:schemas-microsoft-com:office:office" xmlns:oel="http://schemas.microsoft.com/office/2019/extlst" xmlns:r="http://schemas.openxmlformats.org/officeDocument/2006/relationships" xmlns:m="http://schemas.openxmlformats.org/officeDocument/2006/math" xmlns:v="urn:schemas-microsoft-com:vml" xmlns:wp14="http://schemas.microsoft.com/office/word/2010/wordprocessingDrawing" xmlns:wp="http://schemas.openxmlformats.org/drawingml/2006/wordprocessingDrawing" xmlns:w10="urn:schemas-microsoft-com:office:word" xmlns:w="http://schemas.openxmlformats.org/wordprocessingml/2006/main" xmlns:w14="http://schemas.microsoft.com/office/word/2010/wordml" xmlns:w15="http://schemas.microsoft.com/office/word/2012/wordml" xmlns:w16cex="http://schemas.microsoft.com/office/word/2018/wordml/cex" xmlns:w16cid="http://schemas.microsoft.com/office/word/2016/wordml/cid" xmlns:w16="http://schemas.microsoft.com/office/word/2018/wordml" xmlns:w16du="http://schemas.microsoft.com/office/word/2023/wordml/word16du" xmlns:w16sdtdh="http://schemas.microsoft.com/office/word/2020/wordml/sdtdatahash" xmlns:w16se="http://schemas.microsoft.com/office/word/2015/wordml/symex" xmlns:wpg="http://schemas.microsoft.com/office/word/2010/wordprocessingGroup" xmlns:wpi="http://schemas.microsoft.com/office/word/2010/wordprocessingInk" xmlns:wne="http://schemas.microsoft.com/office/word/2006/wordml" xmlns:wps="http://schemas.microsoft.com/office/word/2010/wordprocessingShape" mc:Ignorable="w14 w15 w16se w16cid w16 w16cex w16sdtdh w16du wp14">
+<w:footnotes xmlns:wpc="http://schemas.microsoft.com/office/word/2010/wordprocessingCanvas" xmlns:cx="http://schemas.microsoft.com/office/drawing/2014/chartex" xmlns:cx1="http://schemas.microsoft.com/office/drawing/2015/9/8/chartex" xmlns:cx2="http://schemas.microsoft.com/office/drawing/2015/10/21/chartex" xmlns:cx3="http://schemas.microsoft.com/office/drawing/2016/5/9/chartex" xmlns:cx4="http://schemas.microsoft.com/office/drawing/2016/5/10/chartex" xmlns:cx5="http://schemas.microsoft.com/office/drawing/2016/5/11/chartex" xmlns:cx6="http://schemas.microsoft.com/office/drawing/2016/5/12/chartex" xmlns:cx7="http://schemas.microsoft.com/office/drawing/2016/5/13/chartex" xmlns:cx8="http://schemas.microsoft.com/office/drawing/2016/5/14/chartex" xmlns:mc="http://schemas.openxmlformats.org/markup-compatibility/2006" xmlns:aink="http://schemas.microsoft.com/office/drawing/2016/ink" xmlns:am3d="http://schemas.microsoft.com/office/drawing/2017/model3d" xmlns:o="urn:schemas-microsoft-com:office:office" xmlns:oel="http://schemas.microsoft.com/office/2019/extlst" xmlns:r="http://schemas.openxmlformats.org/officeDocument/2006/relationships" xmlns:m="http://schemas.openxmlformats.org/officeDocument/2006/math" xmlns:v="urn:schemas-microsoft-com:vml" xmlns:wp14="http://schemas.microsoft.com/office/word/2010/wordprocessingDrawing" xmlns:wp="http://schemas.openxmlformats.org/drawingml/2006/wordprocessingDrawing" xmlns:w10="urn:schemas-microsoft-com:office:word" xmlns:w="http://schemas.openxmlformats.org/wordprocessingml/2006/main" xmlns:w14="http://schemas.microsoft.com/office/word/2010/wordml" xmlns:w15="http://schemas.microsoft.com/office/word/2012/wordml" xmlns:w16cex="http://schemas.microsoft.com/office/word/2018/wordml/cex" xmlns:w16cid="http://schemas.microsoft.com/office/word/2016/wordml/cid" xmlns:w16="http://schemas.microsoft.com/office/word/2018/wordml" xmlns:w16du="http://schemas.microsoft.com/office/word/2023/wordml/word16du" xmlns:w16sdtdh="http://schemas.microsoft.com/office/word/2020/wordml/sdtdatahash" xmlns:w16sdtfl="http://schemas.microsoft.com/office/word/2024/wordml/sdtformatlock" xmlns:w16se="http://schemas.microsoft.com/office/word/2015/wordml/symex" xmlns:wpg="http://schemas.microsoft.com/office/word/2010/wordprocessingGroup" xmlns:wpi="http://schemas.microsoft.com/office/word/2010/wordprocessingInk" xmlns:wne="http://schemas.microsoft.com/office/word/2006/wordml" xmlns:wps="http://schemas.microsoft.com/office/word/2010/wordprocessingShape" mc:Ignorable="w14 w15 w16se w16cid w16 w16cex w16sdtdh w16sdtfl w16du wp14">
   <w:footnote w:type="separator" w:id="-1">
     <w:p>
       <w:pPr>
@@ -12911,7 +12619,7 @@
 </file>
 
 <file path=word/numbering.xml><?xml version="1.0" encoding="utf-8"?>
-<w:numbering xmlns:wpc="http://schemas.microsoft.com/office/word/2010/wordprocessingCanvas" xmlns:cx="http://schemas.microsoft.com/office/drawing/2014/chartex" xmlns:cx1="http://schemas.microsoft.com/office/drawing/2015/9/8/chartex" xmlns:cx2="http://schemas.microsoft.com/office/drawing/2015/10/21/chartex" xmlns:cx3="http://schemas.microsoft.com/office/drawing/2016/5/9/chartex" xmlns:cx4="http://schemas.microsoft.com/office/drawing/2016/5/10/chartex" xmlns:cx5="http://schemas.microsoft.com/office/drawing/2016/5/11/chartex" xmlns:cx6="http://schemas.microsoft.com/office/drawing/2016/5/12/chartex" xmlns:cx7="http://schemas.microsoft.com/office/drawing/2016/5/13/chartex" xmlns:cx8="http://schemas.microsoft.com/office/drawing/2016/5/14/chartex" xmlns:mc="http://schemas.openxmlformats.org/markup-compatibility/2006" xmlns:aink="http://schemas.microsoft.com/office/drawing/2016/ink" xmlns:am3d="http://schemas.microsoft.com/office/drawing/2017/model3d" xmlns:o="urn:schemas-microsoft-com:office:office" xmlns:oel="http://schemas.microsoft.com/office/2019/extlst" xmlns:r="http://schemas.openxmlformats.org/officeDocument/2006/relationships" xmlns:m="http://schemas.openxmlformats.org/officeDocument/2006/math" xmlns:v="urn:schemas-microsoft-com:vml" xmlns:wp14="http://schemas.microsoft.com/office/word/2010/wordprocessingDrawing" xmlns:wp="http://schemas.openxmlformats.org/drawingml/2006/wordprocessingDrawing" xmlns:w10="urn:schemas-microsoft-com:office:word" xmlns:w="http://schemas.openxmlformats.org/wordprocessingml/2006/main" xmlns:w14="http://schemas.microsoft.com/office/word/2010/wordml" xmlns:w15="http://schemas.microsoft.com/office/word/2012/wordml" xmlns:w16cex="http://schemas.microsoft.com/office/word/2018/wordml/cex" xmlns:w16cid="http://schemas.microsoft.com/office/word/2016/wordml/cid" xmlns:w16="http://schemas.microsoft.com/office/word/2018/wordml" xmlns:w16du="http://schemas.microsoft.com/office/word/2023/wordml/word16du" xmlns:w16sdtdh="http://schemas.microsoft.com/office/word/2020/wordml/sdtdatahash" xmlns:w16se="http://schemas.microsoft.com/office/word/2015/wordml/symex" xmlns:wpg="http://schemas.microsoft.com/office/word/2010/wordprocessingGroup" xmlns:wpi="http://schemas.microsoft.com/office/word/2010/wordprocessingInk" xmlns:wne="http://schemas.microsoft.com/office/word/2006/wordml" xmlns:wps="http://schemas.microsoft.com/office/word/2010/wordprocessingShape" mc:Ignorable="w14 w15 w16se w16cid w16 w16cex w16sdtdh w16du wp14">
+<w:numbering xmlns:wpc="http://schemas.microsoft.com/office/word/2010/wordprocessingCanvas" xmlns:cx="http://schemas.microsoft.com/office/drawing/2014/chartex" xmlns:cx1="http://schemas.microsoft.com/office/drawing/2015/9/8/chartex" xmlns:cx2="http://schemas.microsoft.com/office/drawing/2015/10/21/chartex" xmlns:cx3="http://schemas.microsoft.com/office/drawing/2016/5/9/chartex" xmlns:cx4="http://schemas.microsoft.com/office/drawing/2016/5/10/chartex" xmlns:cx5="http://schemas.microsoft.com/office/drawing/2016/5/11/chartex" xmlns:cx6="http://schemas.microsoft.com/office/drawing/2016/5/12/chartex" xmlns:cx7="http://schemas.microsoft.com/office/drawing/2016/5/13/chartex" xmlns:cx8="http://schemas.microsoft.com/office/drawing/2016/5/14/chartex" xmlns:mc="http://schemas.openxmlformats.org/markup-compatibility/2006" xmlns:aink="http://schemas.microsoft.com/office/drawing/2016/ink" xmlns:am3d="http://schemas.microsoft.com/office/drawing/2017/model3d" xmlns:o="urn:schemas-microsoft-com:office:office" xmlns:oel="http://schemas.microsoft.com/office/2019/extlst" xmlns:r="http://schemas.openxmlformats.org/officeDocument/2006/relationships" xmlns:m="http://schemas.openxmlformats.org/officeDocument/2006/math" xmlns:v="urn:schemas-microsoft-com:vml" xmlns:wp14="http://schemas.microsoft.com/office/word/2010/wordprocessingDrawing" xmlns:wp="http://schemas.openxmlformats.org/drawingml/2006/wordprocessingDrawing" xmlns:w10="urn:schemas-microsoft-com:office:word" xmlns:w="http://schemas.openxmlformats.org/wordprocessingml/2006/main" xmlns:w14="http://schemas.microsoft.com/office/word/2010/wordml" xmlns:w15="http://schemas.microsoft.com/office/word/2012/wordml" xmlns:w16cex="http://schemas.microsoft.com/office/word/2018/wordml/cex" xmlns:w16cid="http://schemas.microsoft.com/office/word/2016/wordml/cid" xmlns:w16="http://schemas.microsoft.com/office/word/2018/wordml" xmlns:w16du="http://schemas.microsoft.com/office/word/2023/wordml/word16du" xmlns:w16sdtdh="http://schemas.microsoft.com/office/word/2020/wordml/sdtdatahash" xmlns:w16sdtfl="http://schemas.microsoft.com/office/word/2024/wordml/sdtformatlock" xmlns:w16se="http://schemas.microsoft.com/office/word/2015/wordml/symex" xmlns:wpg="http://schemas.microsoft.com/office/word/2010/wordprocessingGroup" xmlns:wpi="http://schemas.microsoft.com/office/word/2010/wordprocessingInk" xmlns:wne="http://schemas.microsoft.com/office/word/2006/wordml" xmlns:wps="http://schemas.microsoft.com/office/word/2010/wordprocessingShape" mc:Ignorable="w14 w15 w16se w16cid w16 w16cex w16sdtdh w16sdtfl w16du wp14">
   <w:abstractNum w:abstractNumId="0" w15:restartNumberingAfterBreak="0">
     <w:nsid w:val="07711F33"/>
     <w:multiLevelType w:val="multilevel"/>
@@ -14699,7 +14407,7 @@
 </file>
 
 <file path=word/styles.xml><?xml version="1.0" encoding="utf-8"?>
-<w:styles xmlns:mc="http://schemas.openxmlformats.org/markup-compatibility/2006" xmlns:r="http://schemas.openxmlformats.org/officeDocument/2006/relationships" xmlns:w="http://schemas.openxmlformats.org/wordprocessingml/2006/main" xmlns:w14="http://schemas.microsoft.com/office/word/2010/wordml" xmlns:w15="http://schemas.microsoft.com/office/word/2012/wordml" xmlns:w16cex="http://schemas.microsoft.com/office/word/2018/wordml/cex" xmlns:w16cid="http://schemas.microsoft.com/office/word/2016/wordml/cid" xmlns:w16="http://schemas.microsoft.com/office/word/2018/wordml" xmlns:w16du="http://schemas.microsoft.com/office/word/2023/wordml/word16du" xmlns:w16sdtdh="http://schemas.microsoft.com/office/word/2020/wordml/sdtdatahash" xmlns:w16se="http://schemas.microsoft.com/office/word/2015/wordml/symex" mc:Ignorable="w14 w15 w16se w16cid w16 w16cex w16sdtdh w16du">
+<w:styles xmlns:mc="http://schemas.openxmlformats.org/markup-compatibility/2006" xmlns:r="http://schemas.openxmlformats.org/officeDocument/2006/relationships" xmlns:w="http://schemas.openxmlformats.org/wordprocessingml/2006/main" xmlns:w14="http://schemas.microsoft.com/office/word/2010/wordml" xmlns:w15="http://schemas.microsoft.com/office/word/2012/wordml" xmlns:w16cex="http://schemas.microsoft.com/office/word/2018/wordml/cex" xmlns:w16cid="http://schemas.microsoft.com/office/word/2016/wordml/cid" xmlns:w16="http://schemas.microsoft.com/office/word/2018/wordml" xmlns:w16du="http://schemas.microsoft.com/office/word/2023/wordml/word16du" xmlns:w16sdtdh="http://schemas.microsoft.com/office/word/2020/wordml/sdtdatahash" xmlns:w16sdtfl="http://schemas.microsoft.com/office/word/2024/wordml/sdtformatlock" xmlns:w16se="http://schemas.microsoft.com/office/word/2015/wordml/symex" mc:Ignorable="w14 w15 w16se w16cid w16 w16cex w16sdtdh w16sdtfl w16du">
   <w:docDefaults>
     <w:rPrDefault>
       <w:rPr>

</xml_diff>